<commit_message>
Match downloadable self-assessment to published portfolio text
</commit_message>
<xml_diff>
--- a/documents/Professional Self Assessment Jose Bustamante.docx
+++ b/documents/Professional Self Assessment Jose Bustamante.docx
@@ -188,23 +188,39 @@
     </w:p>
     <w:p>
       <w:r>
-        <w:t>Next Steps</w:t>
-      </w:r>
-    </w:p>
-    <w:p>
-      <w:r>
-        <w:t xml:space="preserve">Previous courses </w:t>
-      </w:r>
-      <w:r>
-        <w:t>are examples of my learning across the program. They provide context for my skills and goals; they are not additional capstone artifacts. My capstone work shows how software design, algorithms, databases, communication, and security connect in one application.</w:t>
-      </w:r>
-    </w:p>
-    <w:p>
-      <w:r>
-        <w:t>I want to keep building my cybersecurity and data analysis skills after graduation. I am considering certifications such as Security+ and further training in data analysis. I also want to improve my testing skills and learn more about secure password storage. This program helped me become more careful about how I build, review, and explain software. I can now look at an existing project, find weaknesses, make useful changes, and describe the results in a clear way.</w:t>
-      </w:r>
-    </w:p>
-    <w:p/>
+        <w:t>Professional Growth and Career Goals</w:t>
+      </w:r>
+    </w:p>
+    <w:p>
+      <w:r>
+        <w:t>My coursework helped me understand the kind of work I want to do and the habits I want to bring to a workplace. I am interested in cybersecurity and data analysis because I enjoy finding problems, understanding information, and thinking about how to protect it. Software development gives me a foundation for both areas. Knowing how an application is built helps me ask better questions about how it uses data and where it may fail.</w:t>
+      </w:r>
+    </w:p>
+    <w:p>
+      <w:r>
+        <w:t>In CS 340, my Grazioso Salvare dashboard connected a Python CRUD module and MongoDB to a table, chart, map, and rescue filters. That project helped me see how technical work can support a person's decisions. The goal was not just to show data. It was to help someone find useful information without searching through every record by hand. This experience strengthened my interest in work that connects data, clear communication, and practical needs.</w:t>
+      </w:r>
+    </w:p>
+    <w:p>
+      <w:r>
+        <w:t>CS 300 helped me think more carefully about the steps a program takes to solve a problem. CS 305 helped me look for security concerns and explain why they matter. Together with my other coursework, these experiences changed how I approach a project. I try to understand the problem first, review the existing work, make a clear change, and check the result. When something does not work, I need to understand the cause instead of only making the error disappear.</w:t>
+      </w:r>
+    </w:p>
+    <w:p>
+      <w:r>
+        <w:t>One strength I am developing is explaining my work honestly. I can describe what I changed, why I changed it, and what evidence supports the result. I also recognize when a feature still needs improvement. My Weight Tracker project taught me that a working application can still have security limitations, and that a clearer loop does not automatically prove a speed increase. Being precise about these differences is a habit I want to bring to my professional work.</w:t>
+      </w:r>
+    </w:p>
+    <w:p>
+      <w:r>
+        <w:t>As a new graduate, I want to contribute through careful problem-solving, readable code, and a willingness to learn from feedback. I want to understand the needs of the people using a system and communicate clearly with the people maintaining it. I still have more to learn, especially about secure password storage, automated testing, and data analysis. I am considering Security+ and further study in these areas as part of my next steps.</w:t>
+      </w:r>
+    </w:p>
+    <w:p>
+      <w:r>
+        <w:t>This portfolio brings my learning together through one capstone artifact. The three Weight Tracker enhancements show how software design, algorithms, databases, and security affect each other. The code review and narratives explain my decisions and what I learned along the way. I am finishing the program with a stronger foundation, clearer career goals, and work I can use to explain what I am ready to contribute and where I want to grow.</w:t>
+      </w:r>
+    </w:p>
     <w:sectPr>
       <w:pgSz w:w="12240" w:h="15840"/>
       <w:pgMar w:top="1440" w:right="1440" w:bottom="1440" w:left="1440" w:header="720" w:footer="720" w:gutter="0"/>

</xml_diff>